<commit_message>
Add legal pages and update book system
</commit_message>
<xml_diff>
--- a/main/dev/books/input/vithakka-suththa-01.docx
+++ b/main/dev/books/input/vithakka-suththa-01.docx
@@ -3,6 +3,9 @@
 <w:document xmlns:wpc="http://schemas.microsoft.com/office/word/2010/wordprocessingCanvas" xmlns:cx="http://schemas.microsoft.com/office/drawing/2014/chartex" xmlns:cx1="http://schemas.microsoft.com/office/drawing/2015/9/8/chartex" xmlns:cx2="http://schemas.microsoft.com/office/drawing/2015/10/21/chartex" xmlns:cx3="http://schemas.microsoft.com/office/drawing/2016/5/9/chartex" xmlns:cx4="http://schemas.microsoft.com/office/drawing/2016/5/10/chartex" xmlns:cx5="http://schemas.microsoft.com/office/drawing/2016/5/11/chartex" xmlns:cx6="http://schemas.microsoft.com/office/drawing/2016/5/12/chartex" xmlns:cx7="http://schemas.microsoft.com/office/drawing/2016/5/13/chartex" xmlns:cx8="http://schemas.microsoft.com/office/drawing/2016/5/14/chartex" xmlns:mc="http://schemas.openxmlformats.org/markup-compatibility/2006" xmlns:aink="http://schemas.microsoft.com/office/drawing/2016/ink" xmlns:am3d="http://schemas.microsoft.com/office/drawing/2017/model3d" xmlns:o="urn:schemas-microsoft-com:office:office" xmlns:oel="http://schemas.microsoft.com/office/2019/extlst" xmlns:r="http://schemas.openxmlformats.org/officeDocument/2006/relationships" xmlns:m="http://schemas.openxmlformats.org/officeDocument/2006/math" xmlns:v="urn:schemas-microsoft-com:vml" xmlns:wp14="http://schemas.microsoft.com/office/word/2010/wordprocessingDrawing" xmlns:wp="http://schemas.openxmlformats.org/drawingml/2006/wordprocessingDrawing" xmlns:w10="urn:schemas-microsoft-com:office:word" xmlns:w="http://schemas.openxmlformats.org/wordprocessingml/2006/main" xmlns:w14="http://schemas.microsoft.com/office/word/2010/wordml" xmlns:w15="http://schemas.microsoft.com/office/word/2012/wordml" xmlns:w16cex="http://schemas.microsoft.com/office/word/2018/wordml/cex" xmlns:w16cid="http://schemas.microsoft.com/office/word/2016/wordml/cid" xmlns:w16="http://schemas.microsoft.com/office/word/2018/wordml" xmlns:w16du="http://schemas.microsoft.com/office/word/2023/wordml/word16du" xmlns:w16sdtdh="http://schemas.microsoft.com/office/word/2020/wordml/sdtdatahash" xmlns:w16sdtfl="http://schemas.microsoft.com/office/word/2024/wordml/sdtformatlock" xmlns:w16se="http://schemas.microsoft.com/office/word/2015/wordml/symex" xmlns:wpg="http://schemas.microsoft.com/office/word/2010/wordprocessingGroup" xmlns:wpi="http://schemas.microsoft.com/office/word/2010/wordprocessingInk" xmlns:wne="http://schemas.microsoft.com/office/word/2006/wordml" xmlns:wps="http://schemas.microsoft.com/office/word/2010/wordprocessingShape" mc:Ignorable="w14 w15 w16se w16cid w16 w16cex w16sdtdh w16sdtfl w16du wp14">
   <w:body>
     <w:p>
+      <w:pPr>
+        <w:pStyle w:val="Heading1"/>
+      </w:pPr>
       <w:proofErr w:type="spellStart"/>
       <w:r>
         <w:rPr>
@@ -909,36 +912,32 @@
       <w:proofErr w:type="spellStart"/>
       <w:r>
         <w:rPr>
-          <w:rStyle w:val="Heading1Char"/>
-          <w:cs/>
-          <w:lang w:bidi="si-LK"/>
+          <w:rStyle w:val="subheadChar"/>
+          <w:cs/>
         </w:rPr>
         <w:t>අනවඤ්ඤත්ති</w:t>
       </w:r>
       <w:proofErr w:type="spellEnd"/>
       <w:r>
         <w:rPr>
-          <w:rStyle w:val="Heading1Char"/>
-          <w:cs/>
-          <w:lang w:bidi="si-LK"/>
-        </w:rPr>
-        <w:t xml:space="preserve"> </w:t>
-      </w:r>
-      <w:proofErr w:type="spellStart"/>
-      <w:r>
-        <w:rPr>
-          <w:rStyle w:val="Heading1Char"/>
-          <w:cs/>
-          <w:lang w:bidi="si-LK"/>
+          <w:rStyle w:val="subheadChar"/>
+          <w:cs/>
+        </w:rPr>
+        <w:t xml:space="preserve"> </w:t>
+      </w:r>
+      <w:proofErr w:type="spellStart"/>
+      <w:r>
+        <w:rPr>
+          <w:rStyle w:val="subheadChar"/>
+          <w:cs/>
         </w:rPr>
         <w:t>විතර්කය</w:t>
       </w:r>
       <w:proofErr w:type="spellEnd"/>
       <w:r>
         <w:rPr>
-          <w:rStyle w:val="Heading1Char"/>
-          <w:cs/>
-          <w:lang w:bidi="si-LK"/>
+          <w:rStyle w:val="subheadChar"/>
+          <w:cs/>
         </w:rPr>
         <w:t>..</w:t>
       </w:r>
@@ -1426,63 +1425,56 @@
       </w:r>
       <w:r>
         <w:rPr>
-          <w:rStyle w:val="Heading1Char"/>
-          <w:cs/>
-          <w:lang w:bidi="si-LK"/>
+          <w:rStyle w:val="subheadChar"/>
+          <w:cs/>
         </w:rPr>
         <w:t xml:space="preserve">ලාභ සත්කාර </w:t>
       </w:r>
       <w:proofErr w:type="spellStart"/>
       <w:r>
         <w:rPr>
-          <w:rStyle w:val="Heading1Char"/>
-          <w:cs/>
-          <w:lang w:bidi="si-LK"/>
+          <w:rStyle w:val="subheadChar"/>
+          <w:cs/>
         </w:rPr>
         <w:t>සිලෝක</w:t>
       </w:r>
       <w:proofErr w:type="spellEnd"/>
       <w:r>
         <w:rPr>
-          <w:rStyle w:val="Heading1Char"/>
-          <w:cs/>
-          <w:lang w:bidi="si-LK"/>
-        </w:rPr>
-        <w:t xml:space="preserve"> </w:t>
-      </w:r>
-      <w:proofErr w:type="spellStart"/>
-      <w:r>
-        <w:rPr>
-          <w:rStyle w:val="Heading1Char"/>
-          <w:cs/>
-          <w:lang w:bidi="si-LK"/>
+          <w:rStyle w:val="subheadChar"/>
+          <w:cs/>
+        </w:rPr>
+        <w:t xml:space="preserve"> </w:t>
+      </w:r>
+      <w:proofErr w:type="spellStart"/>
+      <w:r>
+        <w:rPr>
+          <w:rStyle w:val="subheadChar"/>
+          <w:cs/>
         </w:rPr>
         <w:t>පටිසංයුත්තෝ</w:t>
       </w:r>
       <w:proofErr w:type="spellEnd"/>
       <w:r>
         <w:rPr>
-          <w:rStyle w:val="Heading1Char"/>
-          <w:cs/>
-          <w:lang w:bidi="si-LK"/>
-        </w:rPr>
-        <w:t xml:space="preserve"> </w:t>
-      </w:r>
-      <w:proofErr w:type="spellStart"/>
-      <w:r>
-        <w:rPr>
-          <w:rStyle w:val="Heading1Char"/>
-          <w:cs/>
-          <w:lang w:bidi="si-LK"/>
+          <w:rStyle w:val="subheadChar"/>
+          <w:cs/>
+        </w:rPr>
+        <w:t xml:space="preserve"> </w:t>
+      </w:r>
+      <w:proofErr w:type="spellStart"/>
+      <w:r>
+        <w:rPr>
+          <w:rStyle w:val="subheadChar"/>
+          <w:cs/>
         </w:rPr>
         <w:t>විතක්කෝ</w:t>
       </w:r>
       <w:proofErr w:type="spellEnd"/>
       <w:r>
         <w:rPr>
-          <w:rStyle w:val="Heading1Char"/>
-          <w:cs/>
-          <w:lang w:bidi="si-LK"/>
+          <w:rStyle w:val="subheadChar"/>
+          <w:cs/>
         </w:rPr>
         <w:t>..</w:t>
       </w:r>
@@ -1740,54 +1732,48 @@
       <w:proofErr w:type="spellStart"/>
       <w:r>
         <w:rPr>
-          <w:rStyle w:val="Heading1Char"/>
-          <w:cs/>
-          <w:lang w:bidi="si-LK"/>
+          <w:rStyle w:val="subheadChar"/>
+          <w:cs/>
         </w:rPr>
         <w:t>පරානුද්දයතා</w:t>
       </w:r>
       <w:proofErr w:type="spellEnd"/>
       <w:r>
         <w:rPr>
-          <w:rStyle w:val="Heading1Char"/>
-          <w:cs/>
-          <w:lang w:bidi="si-LK"/>
-        </w:rPr>
-        <w:t xml:space="preserve"> </w:t>
-      </w:r>
-      <w:proofErr w:type="spellStart"/>
-      <w:r>
-        <w:rPr>
-          <w:rStyle w:val="Heading1Char"/>
-          <w:cs/>
-          <w:lang w:bidi="si-LK"/>
+          <w:rStyle w:val="subheadChar"/>
+          <w:cs/>
+        </w:rPr>
+        <w:t xml:space="preserve"> </w:t>
+      </w:r>
+      <w:proofErr w:type="spellStart"/>
+      <w:r>
+        <w:rPr>
+          <w:rStyle w:val="subheadChar"/>
+          <w:cs/>
         </w:rPr>
         <w:t>පටිසංයුත්තෝ</w:t>
       </w:r>
       <w:proofErr w:type="spellEnd"/>
       <w:r>
         <w:rPr>
-          <w:rStyle w:val="Heading1Char"/>
-          <w:cs/>
-          <w:lang w:bidi="si-LK"/>
-        </w:rPr>
-        <w:t xml:space="preserve"> </w:t>
-      </w:r>
-      <w:proofErr w:type="spellStart"/>
-      <w:r>
-        <w:rPr>
-          <w:rStyle w:val="Heading1Char"/>
-          <w:cs/>
-          <w:lang w:bidi="si-LK"/>
+          <w:rStyle w:val="subheadChar"/>
+          <w:cs/>
+        </w:rPr>
+        <w:t xml:space="preserve"> </w:t>
+      </w:r>
+      <w:proofErr w:type="spellStart"/>
+      <w:r>
+        <w:rPr>
+          <w:rStyle w:val="subheadChar"/>
+          <w:cs/>
         </w:rPr>
         <w:t>විතක්කෝ</w:t>
       </w:r>
       <w:proofErr w:type="spellEnd"/>
       <w:r>
         <w:rPr>
-          <w:rStyle w:val="Heading1Char"/>
-          <w:cs/>
-          <w:lang w:bidi="si-LK"/>
+          <w:rStyle w:val="subheadChar"/>
+          <w:cs/>
         </w:rPr>
         <w:t>..</w:t>
       </w:r>
@@ -3656,6 +3642,29 @@
       <w:spacing w:val="5"/>
     </w:rPr>
   </w:style>
+  <w:style w:type="paragraph" w:customStyle="1" w:styleId="subhead">
+    <w:name w:val="subhead"/>
+    <w:basedOn w:val="Heading1"/>
+    <w:link w:val="subheadChar"/>
+    <w:qFormat/>
+    <w:rsid w:val="00DD1CA1"/>
+    <w:rPr>
+      <w:lang w:bidi="si-LK"/>
+    </w:rPr>
+  </w:style>
+  <w:style w:type="character" w:customStyle="1" w:styleId="subheadChar">
+    <w:name w:val="subhead Char"/>
+    <w:basedOn w:val="Heading1Char"/>
+    <w:link w:val="subhead"/>
+    <w:rsid w:val="00DD1CA1"/>
+    <w:rPr>
+      <w:rFonts w:asciiTheme="majorHAnsi" w:eastAsiaTheme="majorEastAsia" w:hAnsiTheme="majorHAnsi" w:cstheme="majorBidi"/>
+      <w:color w:val="2F5496" w:themeColor="accent1" w:themeShade="BF"/>
+      <w:sz w:val="40"/>
+      <w:szCs w:val="40"/>
+      <w:lang w:bidi="si-LK"/>
+    </w:rPr>
+  </w:style>
 </w:styles>
 </file>
 

</xml_diff>